<commit_message>
Fill Weeks 8–10 QDA SOP and lock the sample at 12.
Replace the amalgamation template placeholders with this study's GQI, CIT, and hybrid codebook TA procedures, cite third-party methods sources, and lock n = 12 by information power rather than automatic saturation.

Co-authored-by: delano2x-Procedurals <delano2x-Procedurals@users.noreply.github.com>
</commit_message>
<xml_diff>
--- a/downloads/WALKER_Alignment_Assessment_Data_Collection.docx
+++ b/downloads/WALKER_Alignment_Assessment_Data_Collection.docx
@@ -1985,7 +1985,7 @@
                 <w:i w:val="0"/>
                 <w:sz w:val="20"/>
               </w:rPr>
-              <w:t>Screen 10–15 U.S. SME IT/network managers, 10–200 staff, external-platform recovery, ≥1 event in 36 months; exclude vendor-only staff</w:t>
+              <w:t>Screen 12 U.S. SME IT/network managers, 10–200 staff, external-platform recovery, ≥1 event in 36 months; exclude vendor-only staff</w:t>
             </w:r>
           </w:p>
         </w:tc>
@@ -2975,7 +2975,7 @@
           <w:i w:val="0"/>
           <w:sz w:val="24"/>
         </w:rPr>
-        <w:t xml:space="preserve"> Purposive/criterion, n = 10–15, firm size 10–200, event within 36 months, vendors excluded. Strong as a fit to the Gap; Partial as justification. Write information power (Malterud et al., 2016), not a claim that 10–15 interviews saturate the Gap. Guest et al. (2006) may support a stopping discussion; they are not a CIT or recruitment-method source. Naeem et al. (2024) treat saturation as a decision guide, which is how Practice 2 already used it.</w:t>
+        <w:t xml:space="preserve"> Purposive/criterion, n = 12 locked, firm size 10–200, event within 36 months, vendors excluded. Strong as a fit to the Gap; Partial as justification unless information power is written. Write information power (Malterud et al., 2016), not a claim that 12 interviews saturate the Gap. Guest et al. (2006) may support a stopping discussion; they are not a CIT or recruitment-method source. Naeem et al. (2024) treat saturation as a decision guide, which is how Practice 2 already used it.</w:t>
       </w:r>
     </w:p>
     <w:p>
@@ -5416,7 +5416,7 @@
           <w:i w:val="0"/>
           <w:sz w:val="24"/>
         </w:rPr>
-        <w:t>Analysis will reuse the four-step generic thematic reduction practiced in Data Analysis Practice 2 (Aronson, 1994; Taylor &amp; Bogdan, 1998; Braun &amp; Clarke, 2021). After repeated reading of each de-identified transcript and artifact map, the researcher will (1) lock meaning units that state a practice claim before any theme name is written, (2) confirm each unit with a named excerpt and a negative or boundary case, (3) group related units only when they describe the same salience-to-assurance bargain, and (4) synthesize two separate answers, one for stakeholder-claim/salience enactment and one for decision rights, escalation, and recoverability assurance. Stakeholder-salience constructs function as the Constructs node and as a start-list when Data Collection has no finer steps, not as predetermined theme titles. Saturation is an analytic decision guide (Naeem et al., 2024), not a claim that 10–15 interviews close the Gap.</w:t>
+        <w:t>Analysis will reuse the four-step generic thematic reduction practiced in Data Analysis Practice 2 (Aronson, 1994; Taylor &amp; Bogdan, 1998; Braun &amp; Clarke, 2021). After repeated reading of each de-identified transcript and artifact map, the researcher will (1) lock meaning units that state a practice claim before any theme name is written, (2) confirm each unit with a named excerpt and a negative or boundary case, (3) group related units only when they describe the same salience-to-assurance bargain, and (4) synthesize two separate answers, one for stakeholder-claim/salience enactment and one for decision rights, escalation, and recoverability assurance. Stakeholder-salience constructs function as the Constructs node and as a start-list when Data Collection has no finer steps, not as predetermined theme titles. Saturation is an analytic decision guide (Naeem et al., 2024), not a claim that 12 interviews close the Gap.</w:t>
       </w:r>
     </w:p>
     <w:p>
@@ -6309,7 +6309,7 @@
                 <w:i w:val="0"/>
                 <w:sz w:val="20"/>
               </w:rPr>
-              <w:t>n = 10–15 fits if information power is written</w:t>
+              <w:t>n = 12 locked fits if information power is written</w:t>
             </w:r>
           </w:p>
         </w:tc>

</xml_diff>

<commit_message>
Add offering SOP and abstract to success aligned to the tracking pack.
Defines four success outcomes (Need placement, operational PQ answers, inspectable trail, honored gates) and a daily/weekly/stage SOP that reuses locked n=12, instrument v0.1.1, and prior chapter files.

Co-authored-by: delano2x-Procedurals <delano2x-Procedurals@users.noreply.github.com>
</commit_message>
<xml_diff>
--- a/downloads/WALKER_Alignment_Assessment_Data_Collection.docx
+++ b/downloads/WALKER_Alignment_Assessment_Data_Collection.docx
@@ -653,7 +653,7 @@
           <w:i w:val="0"/>
           <w:sz w:val="24"/>
         </w:rPr>
-        <w:t>The topic is SME IT disaster-recovery governance on external platforms during organizational disruption. The problem is not “recovery tools fail.” It is that managers must handle competing stakeholder claims under time pressure without a clear account of how authority and proof are enacted. That is a qualitative practice problem, not a variance problem.</w:t>
+        <w:t>The topic is SME IT disaster-recovery governance on external platforms during organizational disruption. The problem is not “recovery tools fail.” It is that managers must handle competing stakeholder claims under time pressure without a clear account of how authority and proof are enacted. That is a qualitative practice problem, not a variance problem. The Chapter I Need opening states the specialization (PhD in Business Management, Information Technology Management) and how this IT-governance problem specifically aligns with it ([chapter-i-need-for-the-study.md](chapter-i-need-for-the-study.md)).</w:t>
       </w:r>
     </w:p>
     <w:p>
@@ -698,6 +698,56 @@
           <w:sz w:val="24"/>
         </w:rPr>
         <w:t>Organizations must manage competing stakeholder claims and sustain legitimacy (Donaldson &amp; Preston, 1995; Freeman et al., 2004).</w:t>
+      </w:r>
+    </w:p>
+    <w:p>
+      <w:pPr>
+        <w:pStyle w:val="ListBullet"/>
+        <w:spacing w:line="480" w:lineRule="auto"/>
+      </w:pPr>
+      <w:r>
+        <w:rPr>
+          <w:rFonts w:ascii="Times New Roman" w:hAnsi="Times New Roman" w:eastAsia="Times New Roman"/>
+          <w:b w:val="0"/>
+          <w:i w:val="0"/>
+          <w:sz w:val="24"/>
+        </w:rPr>
+        <w:t xml:space="preserve">Freeman et al. (2020) update that foundation with </w:t>
+      </w:r>
+      <w:r>
+        <w:rPr>
+          <w:rFonts w:ascii="Times New Roman" w:hAnsi="Times New Roman" w:eastAsia="Times New Roman"/>
+          <w:b/>
+          <w:i w:val="0"/>
+          <w:sz w:val="24"/>
+        </w:rPr>
+        <w:t>value-creation stakeholder theory</w:t>
+      </w:r>
+      <w:r>
+        <w:rPr>
+          <w:rFonts w:ascii="Times New Roman" w:hAnsi="Times New Roman" w:eastAsia="Times New Roman"/>
+          <w:b w:val="0"/>
+          <w:i w:val="0"/>
+          <w:sz w:val="24"/>
+        </w:rPr>
+        <w:t>: distinctive stakeholder work describes human actors cooperatively engaged in value creation and trade, and treats many tensions between stakeholder management and strategic-technical objectives as more apparent than real. Placement: Need / What We Know only (</w:t>
+      </w:r>
+      <w:r>
+        <w:rPr>
+          <w:rFonts w:ascii="Times New Roman" w:hAnsi="Times New Roman" w:eastAsia="Times New Roman"/>
+          <w:i/>
+          <w:sz w:val="24"/>
+        </w:rPr>
+        <w:t>VCST</w:t>
+      </w:r>
+      <w:r>
+        <w:rPr>
+          <w:rFonts w:ascii="Times New Roman" w:hAnsi="Times New Roman" w:eastAsia="Times New Roman"/>
+          <w:b w:val="0"/>
+          <w:i w:val="0"/>
+          <w:sz w:val="24"/>
+        </w:rPr>
+        <w:t>). See [chapter-i-need-for-the-study.md](chapter-i-need-for-the-study.md).</w:t>
       </w:r>
     </w:p>
     <w:p>

</xml_diff>